<commit_message>
docs: update latch-article.docx to cover v0.4 (tracing, chaos testing, benchmark results)
- New section: latch.tracing (opt-in event stream via Tracer/LoggingTracer)
  and latch.chaos (seeded failure/latency injection).
- Reproduces the actual benchmarks/chaos_benchmark.py output (seed=1,
  30 orders): naive column double-charged 21/30 orders and reported 9
  as outright failed; protected column had zero double charges and 18
  idempotency cache hits under identical injected latency. This turns
  the article's opening anecdote into a controlled, reproducible result.
- Points to examples/naive_agent_example.py and resilient_agent_example.py
  as a runnable before/after pair.
- Removed the now-stale 'no built-in tracing yet' limitation and
  repointed the roadmap note from v0.4 to v1.0.
- Validated via scripts/office/validate.py (17 paragraphs added, no
  structural issues) and visually confirmed via rendered PDF.
</commit_message>
<xml_diff>
--- a/latch-article.docx
+++ b/latch-article.docx
@@ -44,7 +44,7 @@
           <w:sz w:val="22"/>
           <w:szCs w:val="22"/>
         </w:rPr>
-        <w:t xml:space="preserve">Updated July 2026: this article originally covered v0.1 (idempotency only). The “Where this goes next” section below described a plan; scroll to “Update: v0.2 and v0.3 have shipped” to see what actually got built.</w:t>
+        <w:t xml:space="preserve">Updated July 2026: this article originally covered v0.1 (idempotency only). The “Where this goes next” section below described a plan; scroll to “Update: v0.2 and v0.3 have shipped” and “Update: v0.4 ships tracing, chaos testing, and the numbers to prove it” to see what actually got built.</w:t>
       </w:r>
     </w:p>
     <w:p>
@@ -1879,7 +1879,7 @@
           <w:sz w:val="22"/>
           <w:szCs w:val="22"/>
         </w:rPr>
-        <w:t xml:space="preserve"> has no persistence — compensations run in-process, so a crash mid-saga doesn't resume or roll back on its own — the circuit breaker and budget guardrail hold state per-process rather than across a fleet of replicas, and there's no built-in tracing yet. Those are the honest current limits, written down in the README's “Production considerations” section rather than hidden, and they narrow as the roadmap continues into v0.4 (chaos-injection benchmarking, example agents, tracing hooks) and v1.0.</w:t>
+        <w:t xml:space="preserve"> has no persistence — compensations run in-process, so a crash mid-saga doesn't resume or roll back on its own — and the circuit breaker and budget guardrail still hold state per-process rather than across a fleet of replicas. Those are the honest current limits, written down in the README's “Production considerations” section rather than hidden, and they narrow as the roadmap continues into v1.0. (v0.4 — tracing, chaos testing, and a benchmark to back it up — shipped since; see the next section.)</w:t>
       </w:r>
     </w:p>
     <w:p>
@@ -1888,6 +1888,565 @@
         <w:spacing w:after="160" w:before="300"/>
       </w:pPr>
       <w:r>
+        <w:t xml:space="preserve">Update: v0.4 ships tracing, chaos testing, and the numbers to prove it</w:t>
+      </w:r>
+    </w:p>
+    <w:p>
+      <w:pPr>
+        <w:spacing w:after="200"/>
+      </w:pPr>
+      <w:r>
+        <w:rPr>
+          <w:rFonts w:ascii="Calibri" w:cs="Calibri" w:eastAsia="Calibri" w:hAnsi="Calibri"/>
+          <w:sz w:val="22"/>
+          <w:szCs w:val="22"/>
+        </w:rPr>
+        <w:t xml:space="preserve">The previous update flagged one honest gap: latch had no built-in observability. That's closed as of v0.4, along with something more useful than a feature checkbox — a reproducible benchmark that turns this article's opening paragraph into a controlled experiment instead of an anecdote.</w:t>
+      </w:r>
+    </w:p>
+    <w:p>
+      <w:pPr>
+        <w:spacing w:after="200"/>
+      </w:pPr>
+      <w:r>
+        <w:rPr>
+          <w:rFonts w:ascii="Calibri" w:cs="Calibri" w:eastAsia="Calibri" w:hAnsi="Calibri"/>
+          <w:b/>
+          <w:bCs/>
+          <w:sz w:val="22"/>
+          <w:szCs w:val="22"/>
+        </w:rPr>
+        <w:t xml:space="preserve">latch.tracing — an opt-in event stream. </w:t>
+      </w:r>
+      <w:r>
+        <w:rPr>
+          <w:rFonts w:ascii="Calibri" w:cs="Calibri" w:eastAsia="Calibri" w:hAnsi="Calibri"/>
+          <w:sz w:val="22"/>
+          <w:szCs w:val="22"/>
+        </w:rPr>
+        <w:t xml:space="preserve">Every primitive above can now emit </w:t>
+      </w:r>
+      <w:r>
+        <w:rPr>
+          <w:rFonts w:ascii="Consolas" w:cs="Consolas" w:eastAsia="Consolas" w:hAnsi="Consolas"/>
+          <w:sz w:val="20"/>
+          <w:szCs w:val="20"/>
+        </w:rPr>
+        <w:t xml:space="preserve">TraceEvent</w:t>
+      </w:r>
+      <w:r>
+        <w:rPr>
+          <w:rFonts w:ascii="Calibri" w:cs="Calibri" w:eastAsia="Calibri" w:hAnsi="Calibri"/>
+          <w:sz w:val="22"/>
+          <w:szCs w:val="22"/>
+        </w:rPr>
+        <w:t xml:space="preserve">s about the decisions it makes — a cache hit, a circuit tripping open, a call timing out, a budget rejection, a saga step being compensated — through a thread-safe </w:t>
+      </w:r>
+      <w:r>
+        <w:rPr>
+          <w:rFonts w:ascii="Consolas" w:cs="Consolas" w:eastAsia="Consolas" w:hAnsi="Consolas"/>
+          <w:sz w:val="20"/>
+          <w:szCs w:val="20"/>
+        </w:rPr>
+        <w:t xml:space="preserve">Tracer</w:t>
+      </w:r>
+      <w:r>
+        <w:rPr>
+          <w:rFonts w:ascii="Calibri" w:cs="Calibri" w:eastAsia="Calibri" w:hAnsi="Calibri"/>
+          <w:sz w:val="22"/>
+          <w:szCs w:val="22"/>
+        </w:rPr>
+        <w:t xml:space="preserve"> you subscribe to, or a batteries-included </w:t>
+      </w:r>
+      <w:r>
+        <w:rPr>
+          <w:rFonts w:ascii="Consolas" w:cs="Consolas" w:eastAsia="Consolas" w:hAnsi="Consolas"/>
+          <w:sz w:val="20"/>
+          <w:szCs w:val="20"/>
+        </w:rPr>
+        <w:t xml:space="preserve">LoggingTracer</w:t>
+      </w:r>
+      <w:r>
+        <w:rPr>
+          <w:rFonts w:ascii="Calibri" w:cs="Calibri" w:eastAsia="Calibri" w:hAnsi="Calibri"/>
+          <w:sz w:val="22"/>
+          <w:szCs w:val="22"/>
+        </w:rPr>
+        <w:t xml:space="preserve"> that logs to Python's standard </w:t>
+      </w:r>
+      <w:r>
+        <w:rPr>
+          <w:rFonts w:ascii="Consolas" w:cs="Consolas" w:eastAsia="Consolas" w:hAnsi="Consolas"/>
+          <w:sz w:val="20"/>
+          <w:szCs w:val="20"/>
+        </w:rPr>
+        <w:t xml:space="preserve">logging</w:t>
+      </w:r>
+      <w:r>
+        <w:rPr>
+          <w:rFonts w:ascii="Calibri" w:cs="Calibri" w:eastAsia="Calibri" w:hAnsi="Calibri"/>
+          <w:sz w:val="22"/>
+          <w:szCs w:val="22"/>
+        </w:rPr>
+        <w:t xml:space="preserve"> module with zero extra wiring. </w:t>
+      </w:r>
+      <w:r>
+        <w:rPr>
+          <w:rFonts w:ascii="Consolas" w:cs="Consolas" w:eastAsia="Consolas" w:hAnsi="Consolas"/>
+          <w:sz w:val="20"/>
+          <w:szCs w:val="20"/>
+        </w:rPr>
+        <w:t xml:space="preserve">tracer=</w:t>
+      </w:r>
+      <w:r>
+        <w:rPr>
+          <w:rFonts w:ascii="Calibri" w:cs="Calibri" w:eastAsia="Calibri" w:hAnsi="Calibri"/>
+          <w:sz w:val="22"/>
+          <w:szCs w:val="22"/>
+        </w:rPr>
+        <w:t xml:space="preserve"> is accepted by every primitive and defaults to </w:t>
+      </w:r>
+      <w:r>
+        <w:rPr>
+          <w:rFonts w:ascii="Consolas" w:cs="Consolas" w:eastAsia="Consolas" w:hAnsi="Consolas"/>
+          <w:sz w:val="20"/>
+          <w:szCs w:val="20"/>
+        </w:rPr>
+        <w:t xml:space="preserve">None</w:t>
+      </w:r>
+      <w:r>
+        <w:rPr>
+          <w:rFonts w:ascii="Calibri" w:cs="Calibri" w:eastAsia="Calibri" w:hAnsi="Calibri"/>
+          <w:sz w:val="22"/>
+          <w:szCs w:val="22"/>
+        </w:rPr>
+        <w:t xml:space="preserve">, so it costs nothing until you opt in.</w:t>
+      </w:r>
+    </w:p>
+    <w:p>
+      <w:pPr>
+        <w:spacing w:after="200"/>
+      </w:pPr>
+      <w:r>
+        <w:rPr>
+          <w:rFonts w:ascii="Calibri" w:cs="Calibri" w:eastAsia="Calibri" w:hAnsi="Calibri"/>
+          <w:b/>
+          <w:bCs/>
+          <w:sz w:val="22"/>
+          <w:szCs w:val="22"/>
+        </w:rPr>
+        <w:t xml:space="preserve">latch.chaos — fault injection, on purpose. </w:t>
+      </w:r>
+      <w:r>
+        <w:rPr>
+          <w:rFonts w:ascii="Calibri" w:cs="Calibri" w:eastAsia="Calibri" w:hAnsi="Calibri"/>
+          <w:sz w:val="22"/>
+          <w:szCs w:val="22"/>
+        </w:rPr>
+        <w:t xml:space="preserve">Tracing tells you what happened; </w:t>
+      </w:r>
+      <w:r>
+        <w:rPr>
+          <w:rFonts w:ascii="Consolas" w:cs="Consolas" w:eastAsia="Consolas" w:hAnsi="Consolas"/>
+          <w:sz w:val="20"/>
+          <w:szCs w:val="20"/>
+        </w:rPr>
+        <w:t xml:space="preserve">chaos.py</w:t>
+      </w:r>
+      <w:r>
+        <w:rPr>
+          <w:rFonts w:ascii="Calibri" w:cs="Calibri" w:eastAsia="Calibri" w:hAnsi="Calibri"/>
+          <w:sz w:val="22"/>
+          <w:szCs w:val="22"/>
+        </w:rPr>
+        <w:t xml:space="preserve"> lets you force something to happen so you can check it. </w:t>
+      </w:r>
+      <w:r>
+        <w:rPr>
+          <w:rFonts w:ascii="Consolas" w:cs="Consolas" w:eastAsia="Consolas" w:hAnsi="Consolas"/>
+          <w:sz w:val="20"/>
+          <w:szCs w:val="20"/>
+        </w:rPr>
+        <w:t xml:space="preserve">@chaos</w:t>
+      </w:r>
+      <w:r>
+        <w:rPr>
+          <w:rFonts w:ascii="Calibri" w:cs="Calibri" w:eastAsia="Calibri" w:hAnsi="Calibri"/>
+          <w:sz w:val="22"/>
+          <w:szCs w:val="22"/>
+        </w:rPr>
+        <w:t xml:space="preserve"> injects a configurable probability of failure and/or added latency into any function, seeded for reproducibility. It's deliberately narrow — a probability of raising, and an amount of added delay — because those are exactly the two failure shapes the rest of the library exists to handle.</w:t>
+      </w:r>
+    </w:p>
+    <w:p>
+      <w:pPr>
+        <w:spacing w:after="200"/>
+      </w:pPr>
+      <w:r>
+        <w:rPr>
+          <w:rFonts w:ascii="Consolas" w:cs="Consolas" w:eastAsia="Consolas" w:hAnsi="Consolas"/>
+          <w:sz w:val="20"/>
+          <w:szCs w:val="20"/>
+        </w:rPr>
+        <w:t xml:space="preserve">benchmarks/chaos_benchmark.py</w:t>
+      </w:r>
+      <w:r>
+        <w:rPr>
+          <w:rFonts w:ascii="Calibri" w:cs="Calibri" w:eastAsia="Calibri" w:hAnsi="Calibri"/>
+          <w:sz w:val="22"/>
+          <w:szCs w:val="22"/>
+        </w:rPr>
+        <w:t xml:space="preserve"> takes that machinery and turns this article's opening scenario into a controlled experiment. It runs the same simulated agent — call a slow payment API, give up after a client-side timeout, retry — twice under an identical seeded latency profile: once with no protection, once with </w:t>
+      </w:r>
+      <w:r>
+        <w:rPr>
+          <w:rFonts w:ascii="Consolas" w:cs="Consolas" w:eastAsia="Consolas" w:hAnsi="Consolas"/>
+          <w:sz w:val="20"/>
+          <w:szCs w:val="20"/>
+        </w:rPr>
+        <w:t xml:space="preserve">@with_timeout</w:t>
+      </w:r>
+      <w:r>
+        <w:rPr>
+          <w:rFonts w:ascii="Calibri" w:cs="Calibri" w:eastAsia="Calibri" w:hAnsi="Calibri"/>
+          <w:sz w:val="22"/>
+          <w:szCs w:val="22"/>
+        </w:rPr>
+        <w:t xml:space="preserve"> (outer) wrapping </w:t>
+      </w:r>
+      <w:r>
+        <w:rPr>
+          <w:rFonts w:ascii="Consolas" w:cs="Consolas" w:eastAsia="Consolas" w:hAnsi="Consolas"/>
+          <w:sz w:val="20"/>
+          <w:szCs w:val="20"/>
+        </w:rPr>
+        <w:t xml:space="preserve">@idempotent</w:t>
+      </w:r>
+      <w:r>
+        <w:rPr>
+          <w:rFonts w:ascii="Calibri" w:cs="Calibri" w:eastAsia="Calibri" w:hAnsi="Calibri"/>
+          <w:sz w:val="22"/>
+          <w:szCs w:val="22"/>
+        </w:rPr>
+        <w:t xml:space="preserve"> (inner), the composition order that lets the idempotency cache catch the abandoned background call that </w:t>
+      </w:r>
+      <w:r>
+        <w:rPr>
+          <w:rFonts w:ascii="Consolas" w:cs="Consolas" w:eastAsia="Consolas" w:hAnsi="Consolas"/>
+          <w:sz w:val="20"/>
+          <w:szCs w:val="20"/>
+        </w:rPr>
+        <w:t xml:space="preserve">with_timeout</w:t>
+      </w:r>
+      <w:r>
+        <w:rPr>
+          <w:rFonts w:ascii="Calibri" w:cs="Calibri" w:eastAsia="Calibri" w:hAnsi="Calibri"/>
+          <w:sz w:val="22"/>
+          <w:szCs w:val="22"/>
+        </w:rPr>
+        <w:t xml:space="preserve"> can't kill. One run, seed 1, 30 simulated orders:</w:t>
+      </w:r>
+    </w:p>
+    <w:p>
+      <w:pPr>
+        <w:shd w:fill="F2F2F2" w:val="clear"/>
+        <w:spacing w:after="0"/>
+        <w:ind w:left="200" w:right="200"/>
+      </w:pPr>
+      <w:r>
+        <w:rPr>
+          <w:rFonts w:ascii="Consolas" w:cs="Consolas" w:eastAsia="Consolas" w:hAnsi="Consolas"/>
+          <w:sz w:val="19"/>
+          <w:szCs w:val="19"/>
+        </w:rPr>
+        <w:t xml:space="preserve">metric                             naive   protected</w:t>
+      </w:r>
+    </w:p>
+    <w:p>
+      <w:pPr>
+        <w:shd w:fill="F2F2F2" w:val="clear"/>
+        <w:spacing w:after="0"/>
+        <w:ind w:left="200" w:right="200"/>
+      </w:pPr>
+      <w:r>
+        <w:rPr>
+          <w:rFonts w:ascii="Consolas" w:cs="Consolas" w:eastAsia="Consolas" w:hAnsi="Consolas"/>
+          <w:sz w:val="19"/>
+          <w:szCs w:val="19"/>
+        </w:rPr>
+        <w:t xml:space="preserve">----------------------------------------------------</w:t>
+      </w:r>
+    </w:p>
+    <w:p>
+      <w:pPr>
+        <w:shd w:fill="F2F2F2" w:val="clear"/>
+        <w:spacing w:after="0"/>
+        <w:ind w:left="200" w:right="200"/>
+      </w:pPr>
+      <w:r>
+        <w:rPr>
+          <w:rFonts w:ascii="Consolas" w:cs="Consolas" w:eastAsia="Consolas" w:hAnsi="Consolas"/>
+          <w:sz w:val="19"/>
+          <w:szCs w:val="19"/>
+        </w:rPr>
+        <w:t xml:space="preserve">orders attempted                      30          30</w:t>
+      </w:r>
+    </w:p>
+    <w:p>
+      <w:pPr>
+        <w:shd w:fill="F2F2F2" w:val="clear"/>
+        <w:spacing w:after="0"/>
+        <w:ind w:left="200" w:right="200"/>
+      </w:pPr>
+      <w:r>
+        <w:rPr>
+          <w:rFonts w:ascii="Consolas" w:cs="Consolas" w:eastAsia="Consolas" w:hAnsi="Consolas"/>
+          <w:sz w:val="19"/>
+          <w:szCs w:val="19"/>
+        </w:rPr>
+        <w:t xml:space="preserve">orders reported successful            21          30</w:t>
+      </w:r>
+    </w:p>
+    <w:p>
+      <w:pPr>
+        <w:shd w:fill="F2F2F2" w:val="clear"/>
+        <w:spacing w:after="0"/>
+        <w:ind w:left="200" w:right="200"/>
+      </w:pPr>
+      <w:r>
+        <w:rPr>
+          <w:rFonts w:ascii="Consolas" w:cs="Consolas" w:eastAsia="Consolas" w:hAnsi="Consolas"/>
+          <w:sz w:val="19"/>
+          <w:szCs w:val="19"/>
+        </w:rPr>
+        <w:t xml:space="preserve">orders reported failed                 9           0</w:t>
+      </w:r>
+    </w:p>
+    <w:p>
+      <w:pPr>
+        <w:shd w:fill="F2F2F2" w:val="clear"/>
+        <w:spacing w:after="0"/>
+        <w:ind w:left="200" w:right="200"/>
+      </w:pPr>
+      <w:r>
+        <w:rPr>
+          <w:rFonts w:ascii="Consolas" w:cs="Consolas" w:eastAsia="Consolas" w:hAnsi="Consolas"/>
+          <w:sz w:val="19"/>
+          <w:szCs w:val="19"/>
+        </w:rPr>
+        <w:t xml:space="preserve">total real charges issued             65          30</w:t>
+      </w:r>
+    </w:p>
+    <w:p>
+      <w:pPr>
+        <w:shd w:fill="F2F2F2" w:val="clear"/>
+        <w:spacing w:after="0"/>
+        <w:ind w:left="200" w:right="200"/>
+      </w:pPr>
+      <w:r>
+        <w:rPr>
+          <w:rFonts w:ascii="Consolas" w:cs="Consolas" w:eastAsia="Consolas" w:hAnsi="Consolas"/>
+          <w:sz w:val="19"/>
+          <w:szCs w:val="19"/>
+        </w:rPr>
+        <w:t xml:space="preserve">orders double-charged                 21           0</w:t>
+      </w:r>
+    </w:p>
+    <w:p>
+      <w:pPr>
+        <w:shd w:fill="F2F2F2" w:val="clear"/>
+        <w:spacing w:after="0"/>
+        <w:ind w:left="200" w:right="200"/>
+      </w:pPr>
+      <w:r>
+        <w:rPr>
+          <w:rFonts w:ascii="Consolas" w:cs="Consolas" w:eastAsia="Consolas" w:hAnsi="Consolas"/>
+          <w:sz w:val="19"/>
+          <w:szCs w:val="19"/>
+        </w:rPr>
+        <w:t xml:space="preserve">idempotency cache hits               n/a          18</w:t>
+      </w:r>
+    </w:p>
+    <w:p>
+      <w:pPr>
+        <w:spacing w:after="200"/>
+      </w:pPr>
+    </w:p>
+    <w:p>
+      <w:pPr>
+        <w:spacing w:after="200"/>
+      </w:pPr>
+      <w:r>
+        <w:rPr>
+          <w:rFonts w:ascii="Calibri" w:cs="Calibri" w:eastAsia="Calibri" w:hAnsi="Calibri"/>
+          <w:sz w:val="22"/>
+          <w:szCs w:val="22"/>
+        </w:rPr>
+        <w:t xml:space="preserve">Same injected latency, same client-timeout-and-retry loop shape — the only variable is whether idempotency is in the stack. The naive column is this article's opening paragraph, reproduced with real code instead of asserted from memory: 21 of 30 simulated orders were silently charged twice, and 9 more were charged at least once while being reported to the agent as failed outright. The protected column shows zero double charges under the same injected chaos. A second run at a different seed (seed 7, 20 orders) reproduces the same pattern — 12 double-charged naive vs. 0 protected — so this isn't a seed-specific fluke.</w:t>
+      </w:r>
+    </w:p>
+    <w:p>
+      <w:pPr>
+        <w:spacing w:after="200"/>
+      </w:pPr>
+      <w:r>
+        <w:rPr>
+          <w:rFonts w:ascii="Calibri" w:cs="Calibri" w:eastAsia="Calibri" w:hAnsi="Calibri"/>
+          <w:b/>
+          <w:bCs/>
+          <w:sz w:val="22"/>
+          <w:szCs w:val="22"/>
+        </w:rPr>
+        <w:t xml:space="preserve">Before/after, live. </w:t>
+      </w:r>
+      <w:r>
+        <w:rPr>
+          <w:rFonts w:ascii="Consolas" w:cs="Consolas" w:eastAsia="Consolas" w:hAnsi="Consolas"/>
+          <w:sz w:val="20"/>
+          <w:szCs w:val="20"/>
+        </w:rPr>
+        <w:t xml:space="preserve">examples/naive_agent_example.py</w:t>
+      </w:r>
+      <w:r>
+        <w:rPr>
+          <w:rFonts w:ascii="Calibri" w:cs="Calibri" w:eastAsia="Calibri" w:hAnsi="Calibri"/>
+          <w:sz w:val="22"/>
+          <w:szCs w:val="22"/>
+        </w:rPr>
+        <w:t xml:space="preserve"> and </w:t>
+      </w:r>
+      <w:r>
+        <w:rPr>
+          <w:rFonts w:ascii="Consolas" w:cs="Consolas" w:eastAsia="Consolas" w:hAnsi="Consolas"/>
+          <w:sz w:val="20"/>
+          <w:szCs w:val="20"/>
+        </w:rPr>
+        <w:t xml:space="preserve">examples/resilient_agent_example.py</w:t>
+      </w:r>
+      <w:r>
+        <w:rPr>
+          <w:rFonts w:ascii="Calibri" w:cs="Calibri" w:eastAsia="Calibri" w:hAnsi="Calibri"/>
+          <w:sz w:val="22"/>
+          <w:szCs w:val="22"/>
+        </w:rPr>
+        <w:t xml:space="preserve"> are a runnable pair built around the same mechanism: the naive version has zero </w:t>
+      </w:r>
+      <w:r>
+        <w:rPr>
+          <w:rFonts w:ascii="Consolas" w:cs="Consolas" w:eastAsia="Consolas" w:hAnsi="Consolas"/>
+          <w:sz w:val="20"/>
+          <w:szCs w:val="20"/>
+        </w:rPr>
+        <w:t xml:space="preserve">latch</w:t>
+      </w:r>
+      <w:r>
+        <w:rPr>
+          <w:rFonts w:ascii="Calibri" w:cs="Calibri" w:eastAsia="Calibri" w:hAnsi="Calibri"/>
+          <w:sz w:val="22"/>
+          <w:szCs w:val="22"/>
+        </w:rPr>
+        <w:t xml:space="preserve"> imports and reproduces a real double charge deterministically; the resilient version protects the identical scenario with all five primitives plus a shared </w:t>
+      </w:r>
+      <w:r>
+        <w:rPr>
+          <w:rFonts w:ascii="Consolas" w:cs="Consolas" w:eastAsia="Consolas" w:hAnsi="Consolas"/>
+          <w:sz w:val="20"/>
+          <w:szCs w:val="20"/>
+        </w:rPr>
+        <w:t xml:space="preserve">LoggingTracer</w:t>
+      </w:r>
+      <w:r>
+        <w:rPr>
+          <w:rFonts w:ascii="Calibri" w:cs="Calibri" w:eastAsia="Calibri" w:hAnsi="Calibri"/>
+          <w:sz w:val="22"/>
+          <w:szCs w:val="22"/>
+        </w:rPr>
+        <w:t xml:space="preserve">, including a two-step </w:t>
+      </w:r>
+      <w:r>
+        <w:rPr>
+          <w:rFonts w:ascii="Consolas" w:cs="Consolas" w:eastAsia="Consolas" w:hAnsi="Consolas"/>
+          <w:sz w:val="20"/>
+          <w:szCs w:val="20"/>
+        </w:rPr>
+        <w:t xml:space="preserve">Saga</w:t>
+      </w:r>
+      <w:r>
+        <w:rPr>
+          <w:rFonts w:ascii="Calibri" w:cs="Calibri" w:eastAsia="Calibri" w:hAnsi="Calibri"/>
+          <w:sz w:val="22"/>
+          <w:szCs w:val="22"/>
+        </w:rPr>
+        <w:t xml:space="preserve"> (charge card, then reserve hotel) with compensation wired up. Run either one directly — real threads, a real (if simulated-in-this-demo) payment call, no mocking.</w:t>
+      </w:r>
+    </w:p>
+    <w:p>
+      <w:pPr>
+        <w:spacing w:after="200"/>
+      </w:pPr>
+      <w:r>
+        <w:rPr>
+          <w:rFonts w:ascii="Calibri" w:cs="Calibri" w:eastAsia="Calibri" w:hAnsi="Calibri"/>
+          <w:sz w:val="22"/>
+          <w:szCs w:val="22"/>
+        </w:rPr>
+        <w:t xml:space="preserve">111 tests now cover all five primitives plus tracing and chaos (up from 72 in v0.3), </w:t>
+      </w:r>
+      <w:r>
+        <w:rPr>
+          <w:rFonts w:ascii="Consolas" w:cs="Consolas" w:eastAsia="Consolas" w:hAnsi="Consolas"/>
+          <w:sz w:val="20"/>
+          <w:szCs w:val="20"/>
+        </w:rPr>
+        <w:t xml:space="preserve">mypy --strict</w:t>
+      </w:r>
+      <w:r>
+        <w:rPr>
+          <w:rFonts w:ascii="Calibri" w:cs="Calibri" w:eastAsia="Calibri" w:hAnsi="Calibri"/>
+          <w:sz w:val="22"/>
+          <w:szCs w:val="22"/>
+        </w:rPr>
+        <w:t xml:space="preserve"> and </w:t>
+      </w:r>
+      <w:r>
+        <w:rPr>
+          <w:rFonts w:ascii="Consolas" w:cs="Consolas" w:eastAsia="Consolas" w:hAnsi="Consolas"/>
+          <w:sz w:val="20"/>
+          <w:szCs w:val="20"/>
+        </w:rPr>
+        <w:t xml:space="preserve">ruff</w:t>
+      </w:r>
+      <w:r>
+        <w:rPr>
+          <w:rFonts w:ascii="Calibri" w:cs="Calibri" w:eastAsia="Calibri" w:hAnsi="Calibri"/>
+          <w:sz w:val="22"/>
+          <w:szCs w:val="22"/>
+        </w:rPr>
+        <w:t xml:space="preserve"> both run clean, and the package still ships with zero required dependencies. Tracing is in-process only — </w:t>
+      </w:r>
+      <w:r>
+        <w:rPr>
+          <w:rFonts w:ascii="Consolas" w:cs="Consolas" w:eastAsia="Consolas" w:hAnsi="Consolas"/>
+          <w:sz w:val="20"/>
+          <w:szCs w:val="20"/>
+        </w:rPr>
+        <w:t xml:space="preserve">TraceEvent</w:t>
+      </w:r>
+      <w:r>
+        <w:rPr>
+          <w:rFonts w:ascii="Calibri" w:cs="Calibri" w:eastAsia="Calibri" w:hAnsi="Calibri"/>
+          <w:sz w:val="22"/>
+          <w:szCs w:val="22"/>
+        </w:rPr>
+        <w:t xml:space="preserve">s aren't automatically exported to OpenTelemetry, Datadog, or any other backend; write a subscriber if you want that. Nothing else about the honest limits from the previous section changed: Saga still has no persistence, and the circuit breaker and budget guardrail still hold state per-process.</w:t>
+      </w:r>
+    </w:p>
+    <w:p>
+      <w:pPr>
+        <w:pStyle w:val="Heading2"/>
+        <w:spacing w:after="160" w:before="300"/>
+      </w:pPr>
+      <w:r>
         <w:t xml:space="preserve">Try it</w:t>
       </w:r>
     </w:p>
@@ -1901,7 +2460,7 @@
           <w:sz w:val="22"/>
           <w:szCs w:val="22"/>
         </w:rPr>
-        <w:t xml:space="preserve">The install command hasn't changed — it now brings all five primitives and both adapters with it:</w:t>
+        <w:t xml:space="preserve">The install command hasn't changed — it now brings all five primitives, both adapters, tracing, and chaos testing with it:</w:t>
       </w:r>
     </w:p>
     <w:p>

</xml_diff>